<commit_message>
Confirme le contact de la politique de confidentialité
Remplace les deux espaces réservés par les coordonnées réelles du porteur de
projet (Boubacar Gueye, bgueye@gmail.com) dans le Markdown et le .docx.
</commit_message>
<xml_diff>
--- a/docs/politique-de-confidentialite.docx
+++ b/docs/politique-de-confidentialite.docx
@@ -43,19 +43,6 @@
     </w:p>
     <w:p>
       <w:pPr>
-        <w:spacing w:after="400"/>
-        <w:shd w:val="clear" w:color="auto" w:fill="F1E6C9"/>
-      </w:pPr>
-      <w:r>
-        <w:rPr>
-          <w:color w:val="4A3F2E"/>
-          <w:sz w:val="20"/>
-        </w:rPr>
-        <w:t>Brouillon en attente de relecture par le porteur de projet — en particulier l'adresse de contact (§10), à confirmer avant publication/soumission aux stores.</w:t>
-      </w:r>
-    </w:p>
-    <w:p>
-      <w:pPr>
         <w:pStyle w:val="Heading1"/>
         <w:spacing w:before="360" w:after="120"/>
       </w:pPr>
@@ -72,7 +59,7 @@
         <w:spacing w:after="160"/>
       </w:pPr>
       <w:r>
-        <w:t>At-Tijaniya est une application indépendante destinée aux disciples de la Tijaniyya, portée par [Nom du porteur de projet à confirmer], à titre individuel — pas une société, pas une association constituée à ce jour. Contact : voir §10.</w:t>
+        <w:t>At-Tijaniya est une application indépendante destinée aux disciples de la Tijaniyya, portée par Boubacar Gueye, à titre individuel — pas une société, pas une association constituée à ce jour. Contact : voir §10.</w:t>
       </w:r>
     </w:p>
     <w:p>
@@ -504,7 +491,7 @@
         <w:spacing w:after="160"/>
       </w:pPr>
       <w:r>
-        <w:t>Pour toute question sur vos données ou cette politique : [adresse e-mail de contact à confirmer].</w:t>
+        <w:t>Pour toute question sur vos données ou cette politique : bgueye@gmail.com.</w:t>
       </w:r>
     </w:p>
     <w:sectPr>

</xml_diff>